<commit_message>
Se ha añadido el conepto fecha real e importe real en los cobros. Se han ampliado los tests de utils.js. Se ha mejorado la presentación del portal del partícipe y se ha añadido fecha cierre únicammente para el portal del partícipe que afecta a préstamos, contratos, cobros y pagos
</commit_message>
<xml_diff>
--- a/tests/Divergencia propuesta de tests con código del dashboard.docx
+++ b/tests/Divergencia propuesta de tests con código del dashboard.docx
@@ -4,7 +4,23 @@
   <w:body>
     <w:p>
       <w:r>
-        <w:t>Divergencia propuesta de tests con código del dashboard:</w:t>
+        <w:t xml:space="preserve">Divergencia propuesta de </w:t>
+      </w:r>
+      <w:proofErr w:type="spellStart"/>
+      <w:r>
+        <w:t>tests</w:t>
+      </w:r>
+      <w:proofErr w:type="spellEnd"/>
+      <w:r>
+        <w:t xml:space="preserve"> con código del </w:t>
+      </w:r>
+      <w:proofErr w:type="spellStart"/>
+      <w:r>
+        <w:t>dashboard</w:t>
+      </w:r>
+      <w:proofErr w:type="spellEnd"/>
+      <w:r>
+        <w:t>:</w:t>
       </w:r>
     </w:p>
     <w:p/>
@@ -52,7 +68,15 @@
     </w:p>
     <w:p>
       <w:r>
-        <w:t>El código usa importe_participacion (el importe original del contrato CCP) donde debería usar el </w:t>
+        <w:t>El código usa </w:t>
+      </w:r>
+      <w:proofErr w:type="spellStart"/>
+      <w:r>
+        <w:t>importe_participacion</w:t>
+      </w:r>
+      <w:proofErr w:type="spellEnd"/>
+      <w:r>
+        <w:t> (el importe original del contrato CCP) donde debería usar el </w:t>
       </w:r>
       <w:r>
         <w:rPr>
@@ -62,7 +86,23 @@
         <w:t>capital vivo proporcional</w:t>
       </w:r>
       <w:r>
-        <w:t> (calcCapitalActivoPrestamo(p) × % participación). Además K1.6 incluye préstamos judicializados cuando no debería.</w:t>
+        <w:t> (</w:t>
+      </w:r>
+      <w:proofErr w:type="spellStart"/>
+      <w:r>
+        <w:t>calcCapitalActivoPrestamo</w:t>
+      </w:r>
+      <w:proofErr w:type="spellEnd"/>
+      <w:r>
+        <w:t xml:space="preserve">(p) × % participación). </w:t>
+      </w:r>
+      <w:proofErr w:type="gramStart"/>
+      <w:r>
+        <w:t>Además</w:t>
+      </w:r>
+      <w:proofErr w:type="gramEnd"/>
+      <w:r>
+        <w:t xml:space="preserve"> K1.6 incluye préstamos judicializados cuando no debería.</w:t>
       </w:r>
     </w:p>
     <w:tbl>
@@ -178,6 +218,9 @@
           </w:tcPr>
           <w:p>
             <w:r>
+              <w:rPr>
+                <w:color w:val="3A7C22" w:themeColor="accent6" w:themeShade="BF"/>
+              </w:rPr>
               <w:t>19.254,16 €</w:t>
             </w:r>
           </w:p>
@@ -189,7 +232,15 @@
             <w:hideMark/>
           </w:tcPr>
           <w:p>
+            <w:pPr>
+              <w:rPr>
+                <w:color w:val="FF0000"/>
+              </w:rPr>
+            </w:pPr>
             <w:r>
+              <w:rPr>
+                <w:color w:val="FF0000"/>
+              </w:rPr>
               <w:t>~50.000 €</w:t>
             </w:r>
           </w:p>
@@ -219,6 +270,9 @@
           </w:tcPr>
           <w:p>
             <w:r>
+              <w:rPr>
+                <w:color w:val="3A7C22" w:themeColor="accent6" w:themeShade="BF"/>
+              </w:rPr>
               <w:t>7.500 €</w:t>
             </w:r>
           </w:p>
@@ -230,7 +284,15 @@
             <w:hideMark/>
           </w:tcPr>
           <w:p>
+            <w:pPr>
+              <w:rPr>
+                <w:color w:val="FF0000"/>
+              </w:rPr>
+            </w:pPr>
             <w:r>
+              <w:rPr>
+                <w:color w:val="FF0000"/>
+              </w:rPr>
               <w:t>20.000 €</w:t>
             </w:r>
           </w:p>
@@ -248,7 +310,15 @@
           </w:tcPr>
           <w:p>
             <w:r>
-              <w:t>K1.8 % jud partícipes</w:t>
+              <w:t xml:space="preserve">K1.8 % </w:t>
+            </w:r>
+            <w:proofErr w:type="spellStart"/>
+            <w:r>
+              <w:t>jud</w:t>
+            </w:r>
+            <w:proofErr w:type="spellEnd"/>
+            <w:r>
+              <w:t xml:space="preserve"> partícipes</w:t>
             </w:r>
           </w:p>
         </w:tc>
@@ -260,6 +330,9 @@
           </w:tcPr>
           <w:p>
             <w:r>
+              <w:rPr>
+                <w:color w:val="3A7C22" w:themeColor="accent6" w:themeShade="BF"/>
+              </w:rPr>
               <w:t>28,03%</w:t>
             </w:r>
           </w:p>
@@ -272,6 +345,9 @@
           </w:tcPr>
           <w:p>
             <w:r>
+              <w:rPr>
+                <w:color w:val="FF0000"/>
+              </w:rPr>
               <w:t>40%</w:t>
             </w:r>
           </w:p>
@@ -307,7 +383,31 @@
     </w:p>
     <w:p>
       <w:r>
-        <w:t>El código divide capitalJudicializado / capitalEnCurso, pero capitalEnCurso en el código es la </w:t>
+        <w:t>El código divide </w:t>
+      </w:r>
+      <w:proofErr w:type="spellStart"/>
+      <w:r>
+        <w:t>capitalJudicializado</w:t>
+      </w:r>
+      <w:proofErr w:type="spellEnd"/>
+      <w:r>
+        <w:t xml:space="preserve"> / </w:t>
+      </w:r>
+      <w:proofErr w:type="spellStart"/>
+      <w:r>
+        <w:t>capitalEnCurso</w:t>
+      </w:r>
+      <w:proofErr w:type="spellEnd"/>
+      <w:r>
+        <w:t>, pero </w:t>
+      </w:r>
+      <w:proofErr w:type="spellStart"/>
+      <w:r>
+        <w:t>capitalEnCurso</w:t>
+      </w:r>
+      <w:proofErr w:type="spellEnd"/>
+      <w:r>
+        <w:t> en el código es la </w:t>
       </w:r>
       <w:r>
         <w:rPr>
@@ -317,7 +417,15 @@
         <w:t>suma de importes brutos</w:t>
       </w:r>
       <w:r>
-        <w:t> (220.000 €), no el capital vivo. El denominador correcto es capitalActivo (116.920,74 €). Resultado: 13,6% en código vs 25,7% en Excel.</w:t>
+        <w:t> (220.000 €), no el capital vivo. El denominador correcto es </w:t>
+      </w:r>
+      <w:proofErr w:type="spellStart"/>
+      <w:r>
+        <w:t>capitalActivo</w:t>
+      </w:r>
+      <w:proofErr w:type="spellEnd"/>
+      <w:r>
+        <w:t> (116.920,74 €). Resultado: 13,6% en código vs 25,7% en Excel.</w:t>
       </w:r>
     </w:p>
     <w:p>
@@ -344,12 +452,57 @@
           <w:b/>
           <w:bCs/>
         </w:rPr>
-        <w:t xml:space="preserve"> Diferencia conceptual en K2.1/K2.2 — Ingresos anuales (Francés con APs)</w:t>
+        <w:t xml:space="preserve"> Diferencia conceptual en K2.1/K2.2 — Ingresos anuales (</w:t>
+      </w:r>
+      <w:proofErr w:type="gramStart"/>
+      <w:r>
+        <w:rPr>
+          <w:b/>
+          <w:bCs/>
+        </w:rPr>
+        <w:t>Francés</w:t>
+      </w:r>
+      <w:proofErr w:type="gramEnd"/>
+      <w:r>
+        <w:rPr>
+          <w:b/>
+          <w:bCs/>
+        </w:rPr>
+        <w:t xml:space="preserve"> con </w:t>
+      </w:r>
+      <w:proofErr w:type="spellStart"/>
+      <w:r>
+        <w:rPr>
+          <w:b/>
+          <w:bCs/>
+        </w:rPr>
+        <w:t>APs</w:t>
+      </w:r>
+      <w:proofErr w:type="spellEnd"/>
+      <w:r>
+        <w:rPr>
+          <w:b/>
+          <w:bCs/>
+        </w:rPr>
+        <w:t>)</w:t>
       </w:r>
     </w:p>
     <w:p>
-      <w:r>
-        <w:t>Para préstamos franceses con amortizaciones parciales, el código pasa los cobros a generateCalendarioTeorico, lo que recalcula el PMT sobre el saldo reducido y cambia los intereses. El Excel usa el </w:t>
+      <w:pPr>
+        <w:rPr>
+          <w:color w:val="3A7C22" w:themeColor="accent6" w:themeShade="BF"/>
+        </w:rPr>
+      </w:pPr>
+      <w:r>
+        <w:t>Para préstamos franceses con amortizaciones parciales, el código pasa los cobros a </w:t>
+      </w:r>
+      <w:proofErr w:type="spellStart"/>
+      <w:r>
+        <w:t>generateCalendarioTeorico</w:t>
+      </w:r>
+      <w:proofErr w:type="spellEnd"/>
+      <w:r>
+        <w:t>, lo que recalcula el PMT sobre el saldo reducido y cambia los intereses. El Excel usa el </w:t>
       </w:r>
       <w:r>
         <w:rPr>
@@ -359,7 +512,30 @@
         <w:t>calendario original</w:t>
       </w:r>
       <w:r>
-        <w:t> sin APs. Esto implica una decisión de negocio: ¿los ingresos previstos se basan en el contrato original o en el estado actual del préstamo? Esto conviene que lo decidas tú.</w:t>
+        <w:t xml:space="preserve"> sin </w:t>
+      </w:r>
+      <w:proofErr w:type="spellStart"/>
+      <w:r>
+        <w:t>APs</w:t>
+      </w:r>
+      <w:proofErr w:type="spellEnd"/>
+      <w:r>
+        <w:t>. Esto implica una decisión de negocio: ¿los ingresos previstos se basan en el contrato original o en el estado actual del préstamo? Esto conviene que lo decidas tú.</w:t>
+      </w:r>
+      <w:r>
+        <w:t xml:space="preserve"> </w:t>
+      </w:r>
+      <w:r>
+        <w:rPr>
+          <w:color w:val="3A7C22" w:themeColor="accent6" w:themeShade="BF"/>
+        </w:rPr>
+        <w:sym w:font="Wingdings" w:char="F0E0"/>
+      </w:r>
+      <w:r>
+        <w:rPr>
+          <w:color w:val="3A7C22" w:themeColor="accent6" w:themeShade="BF"/>
+        </w:rPr>
+        <w:t xml:space="preserve"> Cambiado en el EXCEL.</w:t>
       </w:r>
     </w:p>
     <w:p>
@@ -390,10 +566,42 @@
       </w:r>
     </w:p>
     <w:p>
-      <w:r>
-        <w:t>El denominador de rentParticipes y rentTotalPromocima usa capitalParticipActivos que es la suma de importe_participacion original (30.000 €) en lugar del capital vivo (19.254,16 €). Esto hace que las rentabilidades sean artificialmente más bajas en el código.</w:t>
+      <w:pPr>
+        <w:rPr>
+          <w:color w:val="3A7C22" w:themeColor="accent6" w:themeShade="BF"/>
+        </w:rPr>
+      </w:pPr>
+      <w:r>
+        <w:t>El denominador de rentParticipes y rentTotalPromocima usa capitalParticipActivos que es la suma de </w:t>
+      </w:r>
+      <w:proofErr w:type="spellStart"/>
+      <w:r>
+        <w:t>importe_participacion</w:t>
+      </w:r>
+      <w:proofErr w:type="spellEnd"/>
+      <w:r>
+        <w:t> original (30.000 €) en lugar del capital vivo (19.254,16 €). Esto hace que las rentabilidades sean artificialmente más bajas en el código.</w:t>
+      </w:r>
+      <w:r>
+        <w:rPr>
+          <w:color w:val="3A7C22" w:themeColor="accent6" w:themeShade="BF"/>
+        </w:rPr>
+        <w:t xml:space="preserve"> </w:t>
+      </w:r>
+      <w:r>
+        <w:rPr>
+          <w:color w:val="3A7C22" w:themeColor="accent6" w:themeShade="BF"/>
+        </w:rPr>
+        <w:sym w:font="Wingdings" w:char="F0E0"/>
+      </w:r>
+      <w:r>
+        <w:rPr>
+          <w:color w:val="3A7C22" w:themeColor="accent6" w:themeShade="BF"/>
+        </w:rPr>
+        <w:t xml:space="preserve"> Cambiado en el EXCEL.</w:t>
       </w:r>
     </w:p>
+    <w:p/>
     <w:p>
       <w:r>
         <w:rPr>
@@ -418,12 +626,105 @@
           <w:b/>
           <w:bCs/>
         </w:rPr>
-        <w:t xml:space="preserve"> Problema de testeabilidad: new Date() en lugar de today()</w:t>
+        <w:t xml:space="preserve"> Problema de </w:t>
+      </w:r>
+      <w:proofErr w:type="spellStart"/>
+      <w:r>
+        <w:rPr>
+          <w:b/>
+          <w:bCs/>
+        </w:rPr>
+        <w:t>testeabilidad</w:t>
+      </w:r>
+      <w:proofErr w:type="spellEnd"/>
+      <w:r>
+        <w:rPr>
+          <w:b/>
+          <w:bCs/>
+        </w:rPr>
+        <w:t xml:space="preserve">: new </w:t>
+      </w:r>
+      <w:proofErr w:type="gramStart"/>
+      <w:r>
+        <w:rPr>
+          <w:b/>
+          <w:bCs/>
+        </w:rPr>
+        <w:t>Date(</w:t>
+      </w:r>
+      <w:proofErr w:type="gramEnd"/>
+      <w:r>
+        <w:rPr>
+          <w:b/>
+          <w:bCs/>
+        </w:rPr>
+        <w:t>) en lugar de </w:t>
+      </w:r>
+      <w:proofErr w:type="spellStart"/>
+      <w:r>
+        <w:rPr>
+          <w:b/>
+          <w:bCs/>
+        </w:rPr>
+        <w:t>today</w:t>
+      </w:r>
+      <w:proofErr w:type="spellEnd"/>
+      <w:r>
+        <w:rPr>
+          <w:b/>
+          <w:bCs/>
+        </w:rPr>
+        <w:t>()</w:t>
       </w:r>
     </w:p>
     <w:p>
-      <w:r>
-        <w:t>anoActual y durMedia usan new Date() directamente, en lugar de la función today() que ya existe en utils.js. Esto hace que los tests del dashboard sean </w:t>
+      <w:proofErr w:type="spellStart"/>
+      <w:r>
+        <w:t>anoActual</w:t>
+      </w:r>
+      <w:proofErr w:type="spellEnd"/>
+      <w:r>
+        <w:t> y </w:t>
+      </w:r>
+      <w:proofErr w:type="spellStart"/>
+      <w:r>
+        <w:t>durMedia</w:t>
+      </w:r>
+      <w:proofErr w:type="spellEnd"/>
+      <w:r>
+        <w:t xml:space="preserve"> usan new </w:t>
+      </w:r>
+      <w:proofErr w:type="gramStart"/>
+      <w:r>
+        <w:t>Date(</w:t>
+      </w:r>
+      <w:proofErr w:type="gramEnd"/>
+      <w:r>
+        <w:t>) directamente, en lugar de la función </w:t>
+      </w:r>
+      <w:proofErr w:type="spellStart"/>
+      <w:r>
+        <w:t>today</w:t>
+      </w:r>
+      <w:proofErr w:type="spellEnd"/>
+      <w:r>
+        <w:t xml:space="preserve">() que ya existe en utils.js. Esto hace que los </w:t>
+      </w:r>
+      <w:proofErr w:type="spellStart"/>
+      <w:r>
+        <w:t>tests</w:t>
+      </w:r>
+      <w:proofErr w:type="spellEnd"/>
+      <w:r>
+        <w:t xml:space="preserve"> del </w:t>
+      </w:r>
+      <w:proofErr w:type="spellStart"/>
+      <w:r>
+        <w:t>dashboard</w:t>
+      </w:r>
+      <w:proofErr w:type="spellEnd"/>
+      <w:r>
+        <w:t xml:space="preserve"> sean </w:t>
       </w:r>
       <w:r>
         <w:rPr>
@@ -433,7 +734,15 @@
         <w:t>no deterministas</w:t>
       </w:r>
       <w:r>
-        <w:t> porque dependen de la fecha real del sistema, no de la fecha mockeada.</w:t>
+        <w:t xml:space="preserve"> porque dependen de la fecha real del sistema, no de la fecha </w:t>
+      </w:r>
+      <w:proofErr w:type="spellStart"/>
+      <w:r>
+        <w:t>mockeada</w:t>
+      </w:r>
+      <w:proofErr w:type="spellEnd"/>
+      <w:r>
+        <w:t>.</w:t>
       </w:r>
     </w:p>
     <w:p>
@@ -455,7 +764,47 @@
         <w:t>En resumen:</w:t>
       </w:r>
       <w:r>
-        <w:t> hay 5 KPIs con resultados incorrectos (K1.5, K1.6, K1.7, K1.8, K2.6/K2.7), 1 ambigüedad de negocio que decidir (K2.1 con APs), y 1 problema de arquitectura que hay que corregir antes de escribir tests (new Date() → today()). ¿Quieres que empecemos corrigiendo el código, o primero aclaramos la duda de K2.1?</w:t>
+        <w:t xml:space="preserve"> hay 5 </w:t>
+      </w:r>
+      <w:proofErr w:type="spellStart"/>
+      <w:r>
+        <w:t>KPIs</w:t>
+      </w:r>
+      <w:proofErr w:type="spellEnd"/>
+      <w:r>
+        <w:t xml:space="preserve"> con resultados incorrectos (K1.5, K1.6, K1.7, K1.8, K2.6/K2.7), 1 ambigüedad de negocio que decidir (K2.1 con </w:t>
+      </w:r>
+      <w:proofErr w:type="spellStart"/>
+      <w:r>
+        <w:t>APs</w:t>
+      </w:r>
+      <w:proofErr w:type="spellEnd"/>
+      <w:r>
+        <w:t xml:space="preserve">), y 1 problema de arquitectura que hay que corregir antes de escribir </w:t>
+      </w:r>
+      <w:proofErr w:type="spellStart"/>
+      <w:r>
+        <w:t>tests</w:t>
+      </w:r>
+      <w:proofErr w:type="spellEnd"/>
+      <w:r>
+        <w:t xml:space="preserve"> (new </w:t>
+      </w:r>
+      <w:proofErr w:type="gramStart"/>
+      <w:r>
+        <w:t>Date(</w:t>
+      </w:r>
+      <w:proofErr w:type="gramEnd"/>
+      <w:r>
+        <w:t>) → </w:t>
+      </w:r>
+      <w:proofErr w:type="spellStart"/>
+      <w:r>
+        <w:t>today</w:t>
+      </w:r>
+      <w:proofErr w:type="spellEnd"/>
+      <w:r>
+        <w:t>()). ¿Quieres que empecemos corrigiendo el código, o primero aclaramos la duda de K2.1?</w:t>
       </w:r>
     </w:p>
     <w:p/>

</xml_diff>